<commit_message>
Apply critic council fixes to IoT presentation and speech
Co-Authored-By: Claude Opus 5.5 <noreply@anthropic.com>
Claude-Session: https://claude.ai/code/session_01XBBeEGSkQwXXyvWsro7HdT
</commit_message>
<xml_diff>
--- a/presentation-iot-streaming/Интернет вещей и анализ потоковых данных (текст выступления).docx
+++ b/presentation-iot-streaming/Интернет вещей и анализ потоковых данных (текст выступления).docx
@@ -123,7 +123,7 @@
                 <w:color w:val="17212B"/>
                 <w:sz w:val="20"/>
               </w:rPr>
-              <w:t>около 10:02 (1101 слов при темпе 110 слов в минуту)</w:t>
+              <w:t>около 9:56 (1091 слов при темпе 110 слов в минуту)</w:t>
             </w:r>
           </w:p>
         </w:tc>
@@ -248,7 +248,7 @@
           <w:color w:val="5F6B76"/>
           <w:sz w:val="20"/>
         </w:rPr>
-        <w:t xml:space="preserve">   0:00–0:22</w:t>
+        <w:t xml:space="preserve">   0:00–0:24</w:t>
       </w:r>
     </w:p>
     <w:p>
@@ -258,7 +258,7 @@
     </w:p>
     <w:p>
       <w:r>
-        <w:t>Основная мысль доклада такая: данные интернета вещей поступают непрерывно, поэтому их анализируют как поток, а не пакетами.</w:t>
+        <w:t>Основная мысль доклада такая: данные интернета вещей поступают непрерывно, поэтому их анализируют прежде всего как поток, а пакетная обработка дополняет потоковую.</w:t>
       </w:r>
     </w:p>
     <w:p>
@@ -283,7 +283,7 @@
           <w:color w:val="5F6B76"/>
           <w:sz w:val="20"/>
         </w:rPr>
-        <w:t xml:space="preserve">   0:22–0:53</w:t>
+        <w:t xml:space="preserve">   0:24–0:56</w:t>
       </w:r>
     </w:p>
     <w:p>
@@ -308,7 +308,7 @@
           <w:color w:val="17212B"/>
           <w:sz w:val="26"/>
         </w:rPr>
-        <w:t>Слайд 3. К концу 2025 года в мире около 21 млрд подключённых устройств</w:t>
+        <w:t>Слайд 3. По оценке IoT Analytics, к концу 2025 года в мире около 21 млрд устройств интернета вещей</w:t>
       </w:r>
       <w:r>
         <w:rPr>
@@ -318,7 +318,7 @@
           <w:color w:val="5F6B76"/>
           <w:sz w:val="20"/>
         </w:rPr>
-        <w:t xml:space="preserve">   0:53–1:57</w:t>
+        <w:t xml:space="preserve">   0:56–2:06</w:t>
       </w:r>
     </w:p>
     <w:p>
@@ -328,12 +328,12 @@
     </w:p>
     <w:p>
       <w:r>
-        <w:t>Сам термин предложил Кевин Эштон в 1999 году. Так он назвал презентацию для компании Procter &amp; Gamble о радиочастотных метках в цепочке поставок.</w:t>
+        <w:t>По словам Кевина Эштона, он предложил этот термин в 1999 году. Так называлась его презентация для компании Procter &amp; Gamble о радиочастотных метках в цепочке поставок.</w:t>
       </w:r>
     </w:p>
     <w:p>
       <w:r>
-        <w:t>Масштаб технологии показывают оценки аналитической компании IoT Analytics. В 2024 году в мире было около 18,5 миллиарда подключённых устройств. По оценке на конец 2025 года, их число выросло на 14 процентов, до 21,1 миллиарда. К 2030 году компания прогнозирует около 39 миллиардов устройств, то есть рост примерно на 13 процентов в год. Это оценки и прогноз, и у разных агентств методика подсчёта различается.</w:t>
+        <w:t>Масштаб технологии показывают оценки аналитической компании IoT Analytics. В 2024 году в мире было около 18,5 миллиарда устройств интернета вещей. Смартфоны, компьютеры и планшеты в этот подсчёт не входят. По оценке на конец 2025 года, число устройств выросло на 14 процентов, до 21,1 миллиарда. К 2030 году компания прогнозирует около 39 миллиардов, то есть рост примерно на 13 процентов в год. Другие аналитические компании считают устройства по своей методике, поэтому их оценки отличаются.</w:t>
       </w:r>
     </w:p>
     <w:p>
@@ -358,32 +358,32 @@
           <w:color w:val="5F6B76"/>
           <w:sz w:val="20"/>
         </w:rPr>
-        <w:t xml:space="preserve">   1:57–3:05</w:t>
+        <w:t xml:space="preserve">   2:06–3:08</w:t>
       </w:r>
     </w:p>
     <w:p>
       <w:r>
-        <w:t>Чтобы понять, откуда берётся поток данных, рассмотрим устройство системы интернета вещей. Обычно в ней выделяют четыре уровня.</w:t>
+        <w:t>Чтобы понять, откуда берётся поток данных, рассмотрим устройство системы. Эталонная модель Международного союза электросвязи, рекомендация Y.2060, выделяет четыре уровня. На слайде она показана в упрощённом виде.</w:t>
       </w:r>
     </w:p>
     <w:p>
       <w:r>
-        <w:t>Первый уровень: устройства и датчики. Они измеряют температуру, давление, вибрацию, координаты и другие величины.</w:t>
+        <w:t>Первый уровень: устройства и шлюзы. Датчики измеряют температуру, давление, вибрацию, координаты. Шлюз собирает данные от ближайших устройств, фильтрует их и передаёт дальше. Такие расчёты рядом с источником называют граничными вычислениями.</w:t>
       </w:r>
     </w:p>
     <w:p>
       <w:r>
-        <w:t>Второй уровень: шлюзы и граничные вычисления. Шлюз собирает данные от ближайших устройств, фильтрует их и передаёт дальше. Часть расчётов выполняется прямо здесь, рядом с источником. Такой подход называют граничными вычислениями.</w:t>
+        <w:t>Второй уровень: сеть. Она доставляет сообщения от устройств к платформе. Для этого часто используют MQTT, облегчённый протокол обмена сообщениями по схеме публикации и подписки.</w:t>
       </w:r>
     </w:p>
     <w:p>
       <w:r>
-        <w:t>Третий уровень: сеть и брокер сообщений. Брокер принимает данные от множества устройств и передаёт их системам, которые на них подписаны. Для передачи часто используют протокол MQTT. Это облегчённый протокол, который работает по схеме публикации и подписки. Его версия 5.0 стала стандартом OASIS в 2019 году.</w:t>
+        <w:t>Третий уровень: платформа. Здесь работают общие для всех приложений функции: приём сообщений, обработка и хранение данных.</w:t>
       </w:r>
     </w:p>
     <w:p>
       <w:r>
-        <w:t>Четвёртый уровень: платформа анализа и приложения. Здесь данные обрабатываются, сохраняются и превращаются в отчёты, оповещения и управляющие команды.</w:t>
+        <w:t>Четвёртый уровень: приложения. Они превращают данные в отчёты, оповещения и управляющие команды, которые возвращаются к устройствам.</w:t>
       </w:r>
     </w:p>
     <w:p>
@@ -408,7 +408,7 @@
           <w:color w:val="5F6B76"/>
           <w:sz w:val="20"/>
         </w:rPr>
-        <w:t xml:space="preserve">   3:05–3:56</w:t>
+        <w:t xml:space="preserve">   3:08–3:58</w:t>
       </w:r>
     </w:p>
     <w:p>
@@ -418,12 +418,12 @@
     </w:p>
     <w:p>
       <w:r>
-        <w:t>Во-первых, они поступают непрерывно. Датчик не прекращает работу после одного замера, поэтому набор данных не имеет заранее известного конца.</w:t>
+        <w:t>Во-первых, они поступают непрерывно. Датчик не прекращает работу после одного замера, поэтому у набора данных нет заранее известного конца.</w:t>
       </w:r>
     </w:p>
     <w:p>
       <w:r>
-        <w:t>Во-вторых, каждое измерение привязано ко времени. Значение имеет не только результат замера, но и момент, когда он получен.</w:t>
+        <w:t>Во-вторых, каждое измерение привязано ко времени. Важен не только результат замера, но и момент, когда его сделали.</w:t>
       </w:r>
     </w:p>
     <w:p>
@@ -463,27 +463,22 @@
           <w:color w:val="5F6B76"/>
           <w:sz w:val="20"/>
         </w:rPr>
-        <w:t xml:space="preserve">   3:56–4:48</w:t>
+        <w:t xml:space="preserve">   3:58–4:37</w:t>
       </w:r>
     </w:p>
     <w:p>
       <w:r>
-        <w:t>Отсюда следует различие двух подходов к обработке.</w:t>
+        <w:t>Такие данные можно обрабатывать двумя способами. Главное различие между ними в том, когда появляется результат.</w:t>
       </w:r>
     </w:p>
     <w:p>
       <w:r>
-        <w:t>Пакетная обработка имеет дело с ограниченным набором данных. Данные сначала накапливаются, а затем обрабатываются по расписанию, например раз в сутки. Результат появляется через минуты или часы. Этот подход применяют для отчётов за месяц и для обучения моделей на исторических данных.</w:t>
+        <w:t>Пакетная обработка ждёт, пока данные накопятся, и считает их целиком по расписанию. Потоковая обработка обновляет результат с каждым новым событием. Если результат считают по окнам, он появляется после закрытия окна.</w:t>
       </w:r>
     </w:p>
     <w:p>
       <w:r>
-        <w:t>Потоковая обработка имеет дело с неограниченным потоком. Каждое событие обрабатывается сразу после поступления, а результат обновляется непрерывно. Задержка составляет от долей секунды до нескольких секунд. Этот подход нужен там, где важна быстрая реакция: при обнаружении аварий, контроле оборудования, мониторинге транспорта.</w:t>
-      </w:r>
-    </w:p>
-    <w:p>
-      <w:r>
-        <w:t>На практике два подхода часто дополняют друг друга.</w:t>
+        <w:t>Поэтому быстрая реакция, например на аварию, требует потоковой обработки, а отчёты и обучение моделей на истории удобнее строить пакетно. На практике два подхода дополняют друг друга.</w:t>
       </w:r>
     </w:p>
     <w:p>
@@ -508,22 +503,22 @@
           <w:color w:val="5F6B76"/>
           <w:sz w:val="20"/>
         </w:rPr>
-        <w:t xml:space="preserve">   4:48–5:58</w:t>
+        <w:t xml:space="preserve">   4:37–5:56</w:t>
       </w:r>
     </w:p>
     <w:p>
       <w:r>
-        <w:t>Перейдём к основным понятиям потокового анализа. Их систематически описала модель Dataflow, которую инженеры Google опубликовали в 2015 году. В 2026 году эта работа получила премию VLDB Test of Time, которая отмечает работы с долгосрочным влиянием.</w:t>
+        <w:t>Перейдём к основным понятиям потокового анализа. Их систематизировала модель Dataflow, которую предложили инженеры Google в 2015 году.</w:t>
       </w:r>
     </w:p>
     <w:p>
       <w:r>
-        <w:t>Первое понятие: время события. Это момент, когда измерение произошло на устройстве. Второе понятие: время обработки. Это момент, когда событие дошло до системы. Из-за задержек сети эти моменты расходятся, и события приходят не по порядку.</w:t>
+        <w:t>Время события: это момент, когда измерение произошло на устройстве. Время обработки: это момент, когда событие дошло до системы. На схеме событие 3 произошло раньше события 4, но пришло позже него. Если считать по времени поступления, замер попадёт не в тот интервал, и средние значения исказятся. Поэтому расчёты опираются на время события.</w:t>
       </w:r>
     </w:p>
     <w:p>
       <w:r>
-        <w:t>Корректный анализ опирается на время события. При этом системе нужно понимать, когда данные за период можно считать полными. Для этого используется водяной знак. Он сообщает системе, что событий старше определённого момента больше не ожидается. На схеме событие 3 произошло раньше события 4, но дошло до системы уже после водяного знака. Такое событие считается опоздавшим. Опоздавшие события учитывают отдельно или отбрасывают.</w:t>
+        <w:t>Системе при этом нужно решить, когда данные за период можно считать полными. Для этого служит водяной знак. Система вычисляет его по меткам времени уже пришедших событий с запасом на задержку. Здесь водяной знак равен 4 секундам: события, произошедшие раньше 4-й секунды, считаются полученными. Событие 3 пришло позже и стало опоздавшим. Если водяной знак ставить слишком рано, опоздавших событий будет много, если слишком поздно, результат задержится. Опоздавшие события отбрасывают, сохраняют отдельно или пересчитывают с ними результат окна.</w:t>
       </w:r>
     </w:p>
     <w:p>
@@ -548,12 +543,12 @@
           <w:color w:val="5F6B76"/>
           <w:sz w:val="20"/>
         </w:rPr>
-        <w:t xml:space="preserve">   5:58–6:54</w:t>
+        <w:t xml:space="preserve">   5:56–6:51</w:t>
       </w:r>
     </w:p>
     <w:p>
       <w:r>
-        <w:t>Поток не имеет конца, поэтому посчитать по нему, например, среднее значение напрямую нельзя. Для расчётов поток делят на окна, то есть на конечные интервалы времени. Рассмотрим три основных типа окон. Все они есть, например, в Apache Flink.</w:t>
+        <w:t>Поток не имеет конца, поэтому получить окончательное среднее по нему нельзя. Для расчётов поток делят на окна, то есть на конечные интервалы времени. Рассмотрим три основных типа окон. Все они есть, например, в Apache Flink.</w:t>
       </w:r>
     </w:p>
     <w:p>
@@ -563,7 +558,7 @@
     </w:p>
     <w:p>
       <w:r>
-        <w:t>Скользящие окна тоже имеют фиксированную длину, но сдвигаются с меньшим шагом и поэтому пересекаются. Например, окно длиной пять минут пересчитывается каждую минуту. Так получается сглаженная картина.</w:t>
+        <w:t>Скользящие окна тоже имеют фиксированную длину, но сдвигаются с шагом меньше своей длины и поэтому пересекаются. Например, окно длиной пять минут пересчитывается каждую минуту. Так получается сглаженная картина.</w:t>
       </w:r>
     </w:p>
     <w:p>
@@ -593,27 +588,27 @@
           <w:color w:val="5F6B76"/>
           <w:sz w:val="20"/>
         </w:rPr>
-        <w:t xml:space="preserve">   6:54–7:58</w:t>
+        <w:t xml:space="preserve">   6:51–8:01</w:t>
       </w:r>
     </w:p>
     <w:p>
       <w:r>
-        <w:t>Теперь об инструментах. Типичная потоковая система состоит из двух основных компонентов.</w:t>
+        <w:t>Теперь об инструментах. Типичная потоковая система состоит из двух компонентов.</w:t>
       </w:r>
     </w:p>
     <w:p>
       <w:r>
-        <w:t>Первый компонент: брокер сообщений. Широко используемый пример: Apache Kafka, которую создали в LinkedIn и открыли в 2011 году. Брокер принимает события от устройств, хранит их в журнале и передаёт обработчикам.</w:t>
+        <w:t>Первый компонент: брокер сообщений, например Apache Kafka. Он принимает события от устройств и шлюзов и записывает их в журнал. Журнал хранит события долго, его можно перечитать. Брокер MQTT и Kafka относятся к разным системам, данные между ними передаёт шлюз или коннектор.</w:t>
       </w:r>
     </w:p>
     <w:p>
       <w:r>
-        <w:t>Второй компонент: движок потоковой обработки, например Apache Flink или Spark Structured Streaming. Он применяет к потоку окна, агрегирует данные и передаёт результаты в хранилище и приложения.</w:t>
+        <w:t>Второй компонент: движок потоковой обработки, например Apache Flink или Spark Structured Streaming. Он применяет к потоку окна, агрегирует данные и отправляет результаты в хранилище и приложения. Spark по умолчанию работает микропакетами.</w:t>
       </w:r>
     </w:p>
     <w:p>
       <w:r>
-        <w:t>Компоненты объединяют по разным архитектурам. В архитектуре Lambda, которую описал Натан Марц в 2011 году, данные проходят два контура: пакетный и потоковый. Логику обработки при этом приходится поддерживать дважды. В архитектуре Kappa, которую предложил Джей Крепс в 2014 году, остаётся только потоковый контур. Пересчёт истории в ней выполняется повторным чтением журнала.</w:t>
+        <w:t>Компоненты объединяют по разным архитектурам. В архитектуре Lambda, которую описал Натан Марц, два контура. Пакетный точно пересчитывает всю историю, потоковый быстро даёт предварительный результат. Логику при этом поддерживают дважды. В архитектуре Kappa, которую предложил Джей Крепс, остаётся только потоковый контур, а историю пересчитывают повторным чтением журнала.</w:t>
       </w:r>
     </w:p>
     <w:p>
@@ -628,7 +623,7 @@
           <w:color w:val="17212B"/>
           <w:sz w:val="26"/>
         </w:rPr>
-        <w:t>Слайд 10. Мониторинг насосов: от замера вибрации до оповещения проходит около минуты</w:t>
+        <w:t>Слайд 10. Мониторинг насосов: оповещение приходит после закрытия минутного окна</w:t>
       </w:r>
       <w:r>
         <w:rPr>
@@ -638,7 +633,7 @@
           <w:color w:val="5F6B76"/>
           <w:sz w:val="20"/>
         </w:rPr>
-        <w:t xml:space="preserve">   7:58–8:53</w:t>
+        <w:t xml:space="preserve">   8:01–9:03</w:t>
       </w:r>
     </w:p>
     <w:p>
@@ -653,12 +648,12 @@
     </w:p>
     <w:p>
       <w:r>
-        <w:t>Движок обработки группирует события каждого насоса в фиксированные окна длиной одна минута по времени события. Для каждого окна он считает среднее и максимальное значение вибрации и сравнивает их с допустимым порогом.</w:t>
+        <w:t>Движок обработки группирует события каждого насоса в минутные окна по времени события. Для каждого окна он считает среднее и максимальное значение вибрации и сравнивает их с допустимым порогом.</w:t>
       </w:r>
     </w:p>
     <w:p>
       <w:r>
-        <w:t>Если порог превышен, диспетчер получает оповещение в течение минуты после начала отклонения. Одновременно агрегированные данные сохраняются в хранилище, и по ним строятся пакетные отчёты.</w:t>
+        <w:t>Если порог превышен, диспетчер получает оповещение, когда водяной знак покажет, что окно закрыто. Поэтому задержку здесь задаёт длина окна, а не скорость обработки. Агрегаты сохраняются в хранилище, и по ним строятся пакетные отчёты. По устройству этот пример ближе к архитектуре Kappa.</w:t>
       </w:r>
     </w:p>
     <w:p>
@@ -683,7 +678,7 @@
           <w:color w:val="5F6B76"/>
           <w:sz w:val="20"/>
         </w:rPr>
-        <w:t xml:space="preserve">   8:53–9:41</w:t>
+        <w:t xml:space="preserve">   9:03–9:45</w:t>
       </w:r>
     </w:p>
     <w:p>
@@ -693,7 +688,7 @@
     </w:p>
     <w:p>
       <w:r>
-        <w:t>Первое: в мире работает более 20 миллиардов подключённых устройств, и они непрерывно производят данные с метками времени.</w:t>
+        <w:t>Первое: по оценке IoT Analytics, в мире уже около 21 миллиарда устройств интернета вещей, и они непрерывно производят данные с метками времени.</w:t>
       </w:r>
     </w:p>
     <w:p>
@@ -708,12 +703,7 @@
     </w:p>
     <w:p>
       <w:r>
-        <w:t>Среди ограничений подхода: опоздавшие данные, защита большого числа устройств, стоимость хранения и качество измерений.</w:t>
-      </w:r>
-    </w:p>
-    <w:p>
-      <w:r>
-        <w:t>Главная мысль доклада остаётся прежней: данные интернета вещей поступают непрерывно, поэтому их анализируют как поток, а не пакетами.</w:t>
+        <w:t>Итак, главная мысль доклада: данные интернета вещей поступают непрерывно, поэтому их анализируют прежде всего как поток.</w:t>
       </w:r>
     </w:p>
     <w:p>
@@ -738,12 +728,12 @@
           <w:color w:val="5F6B76"/>
           <w:sz w:val="20"/>
         </w:rPr>
-        <w:t xml:space="preserve">   9:41–10:02</w:t>
+        <w:t xml:space="preserve">   9:45–9:56</w:t>
       </w:r>
     </w:p>
     <w:p>
       <w:r>
-        <w:t>На последнем слайде приведены источники, на которые мы опирались. Это отчёт IoT Analytics, статьи о модели Dataflow и о Kafka, документация Apache Flink и стандарт MQTT. Также мы использовали работы авторов архитектур Lambda и Kappa. Спасибо за внимание.</w:t>
+        <w:t>Источники, на которые мы опирались, приведены на последнем слайде: отраслевой отчёт, стандарты, научные статьи и документация инструментов. Спасибо за внимание.</w:t>
       </w:r>
     </w:p>
     <w:p>
@@ -784,7 +774,7 @@
           <w:color w:val="0E6680"/>
           <w:sz w:val="22"/>
         </w:rPr>
-        <w:t>1. Откуда взяты цифры о числе устройств и насколько они надёжны?</w:t>
+        <w:t>1. Откуда взяты цифры о числе устройств и насколько они свежие?</w:t>
       </w:r>
     </w:p>
     <w:p>
@@ -836,7 +826,7 @@
           <w:color w:val="17212B"/>
           <w:sz w:val="24"/>
         </w:rPr>
-        <w:t>Значение на конец 2025 года рассчитано по данным первого полугодия, поэтому это оценка, а 39 млрд к 2030 году являются прогнозом. Другие агентства дают другие цифры, потому что по-разному считают устройства, например включают или исключают смартфоны и RFID-метки.</w:t>
+        <w:t>Значение на конец 2025 года рассчитано по данным первого полугодия, поэтому это оценка, а 39 млрд к 2030 году являются прогнозом. Смартфоны, компьютеры и планшеты в подсчёт не входят. Более нового отчёта этой компании на момент подготовки доклада мы не нашли. Другие компании считают устройства иначе, поэтому их цифры отличаются.</w:t>
       </w:r>
     </w:p>
     <w:p>
@@ -878,7 +868,7 @@
           <w:color w:val="0E6680"/>
           <w:sz w:val="22"/>
         </w:rPr>
-        <w:t>2. Чем время события отличается от времени обработки на практике?</w:t>
+        <w:t>2. Если пакетная обработка тоже нужна, в каких задачах интернета вещей поток не обязателен?</w:t>
       </w:r>
     </w:p>
     <w:p>
@@ -904,7 +894,7 @@
           <w:color w:val="17212B"/>
           <w:sz w:val="24"/>
         </w:rPr>
-        <w:t>Время события записывает само устройство в момент замера, время обработки фиксирует система при получении сообщения.</w:t>
+        <w:t>Там, где не требуется быстрая реакция.</w:t>
       </w:r>
     </w:p>
     <w:p>
@@ -930,7 +920,7 @@
           <w:color w:val="17212B"/>
           <w:sz w:val="24"/>
         </w:rPr>
-        <w:t>Если датчик потерял связь на десять минут, его замеры придут позже, и по времени обработки они попадут не в тот интервал.</w:t>
+        <w:t>Месячные отчёты, расчёт оплаты по показаниям счётчиков, обучение моделей на исторических данных удобнее и дешевле считать пакетно. Поэтому главная мысль звучит как «прежде всего поток», а пакетная обработка его дополняет.</w:t>
       </w:r>
     </w:p>
     <w:p>
@@ -956,7 +946,7 @@
           <w:color w:val="17212B"/>
           <w:sz w:val="24"/>
         </w:rPr>
-        <w:t>Расчёты по времени события дают корректные агрегаты даже при задержках сети.</w:t>
+        <w:t>Выбор подхода определяется требованием к задержке результата, а не модой на технологию.</w:t>
       </w:r>
     </w:p>
     <w:p>
@@ -972,7 +962,7 @@
           <w:color w:val="0E6680"/>
           <w:sz w:val="22"/>
         </w:rPr>
-        <w:t>3. Как выбрать задержку водяного знака?</w:t>
+        <w:t>3. Почему нельзя просто считать по времени, когда данные пришли?</w:t>
       </w:r>
     </w:p>
     <w:p>
@@ -998,7 +988,7 @@
           <w:color w:val="17212B"/>
           <w:sz w:val="24"/>
         </w:rPr>
-        <w:t>Это компромисс между полнотой и скоростью результата.</w:t>
+        <w:t>Потому что задержки сети переставляют события, и замеры попадают не в тот интервал.</w:t>
       </w:r>
     </w:p>
     <w:p>
@@ -1024,7 +1014,7 @@
           <w:color w:val="17212B"/>
           <w:sz w:val="24"/>
         </w:rPr>
-        <w:t>Чем дольше система ждёт опоздавшие события, тем полнее результат, но тем позже он появляется. Задержку подбирают по наблюдаемому распределению опозданий, а оставшиеся опоздавшие события учитывают отдельно.</w:t>
+        <w:t>Если датчик насоса потерял связь на десять минут, его замеры придут пачкой позже. По времени поступления они попадут в другую минуту, и средняя вибрация за обе минуты исказится.</w:t>
       </w:r>
     </w:p>
     <w:p>
@@ -1050,7 +1040,7 @@
           <w:color w:val="17212B"/>
           <w:sz w:val="24"/>
         </w:rPr>
-        <w:t>От этого параметра зависит, насколько быстро срабатывают оповещения.</w:t>
+        <w:t>Расчёт по времени события даёт корректные агрегаты даже при задержках.</w:t>
       </w:r>
     </w:p>
     <w:p>
@@ -1066,7 +1056,7 @@
           <w:color w:val="0E6680"/>
           <w:sz w:val="22"/>
         </w:rPr>
-        <w:t>4. Можно ли обойтись без потоковой обработки и просто запускать пакетные задания чаще?</w:t>
+        <w:t>4. Откуда система знает, что событий старше четырёх секунд больше не будет? Что будет, если водяной знак поставить слишком рано?</w:t>
       </w:r>
     </w:p>
     <w:p>
@@ -1092,7 +1082,7 @@
           <w:color w:val="17212B"/>
           <w:sz w:val="24"/>
         </w:rPr>
-        <w:t>Частично можно, но задержка останется не меньше интервала запуска и времени расчёта.</w:t>
+        <w:t>Система вычисляет водяной знак по меткам времени уже пришедших событий с запасом на задержку.</w:t>
       </w:r>
     </w:p>
     <w:p>
@@ -1118,7 +1108,7 @@
           <w:color w:val="17212B"/>
           <w:sz w:val="24"/>
         </w:rPr>
-        <w:t>Если задание запускается раз в минуту, результат появится не раньше чем через минуту плюс время обработки, а порядок и опоздания событий всё равно придётся учитывать.</w:t>
+        <w:t>Например, во Flink водяной знак отстаёт от максимальной увиденной метки времени на заданную величину. Если запас мал, опоздавших событий много и результаты приходится пересчитывать; если велик, результат появляется позже.</w:t>
       </w:r>
     </w:p>
     <w:p>
@@ -1144,7 +1134,7 @@
           <w:color w:val="17212B"/>
           <w:sz w:val="24"/>
         </w:rPr>
-        <w:t>Для задач, где нужна реакция за секунды, потоковая обработка проще и надёжнее.</w:t>
+        <w:t>Этот параметр определяет компромисс между полнотой результата и скоростью оповещений.</w:t>
       </w:r>
     </w:p>
     <w:p>
@@ -1160,7 +1150,7 @@
           <w:color w:val="0E6680"/>
           <w:sz w:val="22"/>
         </w:rPr>
-        <w:t>5. Почему Kappa не вытеснила Lambda полностью?</w:t>
+        <w:t>5. Чем пример с минутным окном отличается от пакетного задания, которое запускается раз в минуту? И откуда тогда в таблице доли секунды?</w:t>
       </w:r>
     </w:p>
     <w:p>
@@ -1186,7 +1176,7 @@
           <w:color w:val="17212B"/>
           <w:sz w:val="24"/>
         </w:rPr>
-        <w:t>Потому что повторное чтение большой истории через потоковый контур бывает дорогим.</w:t>
+        <w:t>Доли секунды относятся к обработке отдельного события, а минута задана длиной окна.</w:t>
       </w:r>
     </w:p>
     <w:p>
@@ -1212,7 +1202,7 @@
           <w:color w:val="17212B"/>
           <w:sz w:val="24"/>
         </w:rPr>
-        <w:t>Kappa требует хранить журнал событий достаточно долго и уметь быстро его перечитывать. Когда история очень большая, часть расчётов по-прежнему выполняют пакетно.</w:t>
+        <w:t>Потоковая система обновляет состояние окна при каждом событии и выдаёт результат сразу, как только водяной знак закрыл окно. Пакетному заданию нужно ещё время на запуск, чтение накопленных данных и учёт опоздавших событий.</w:t>
       </w:r>
     </w:p>
     <w:p>
@@ -1238,7 +1228,7 @@
           <w:color w:val="17212B"/>
           <w:sz w:val="24"/>
         </w:rPr>
-        <w:t>Выбор архитектуры зависит от объёма истории и требований к задержке.</w:t>
+        <w:t>Длину окна выбирают под задачу; при окне в 10 секунд оповещение придёт через 10 секунд.</w:t>
       </w:r>
     </w:p>
     <w:p>
@@ -1254,7 +1244,7 @@
           <w:color w:val="0E6680"/>
           <w:sz w:val="22"/>
         </w:rPr>
-        <w:t>6. Где выполнять обработку: на устройстве, на шлюзе или в облаке?</w:t>
+        <w:t>6. Spark Structured Streaming по умолчанию работает микропакетами. Это пакетная или потоковая обработка?</w:t>
       </w:r>
     </w:p>
     <w:p>
@@ -1280,7 +1270,7 @@
           <w:color w:val="17212B"/>
           <w:sz w:val="24"/>
         </w:rPr>
-        <w:t>Простые операции выгодно выполнять рядом с источником, а сложную аналитику выполнять централизованно.</w:t>
+        <w:t>Потоковая: микропакеты очень маленькие и обрабатываются непрерывно.</w:t>
       </w:r>
     </w:p>
     <w:p>
@@ -1306,7 +1296,7 @@
           <w:color w:val="17212B"/>
           <w:sz w:val="24"/>
         </w:rPr>
-        <w:t>На шлюзе фильтруют ошибочные значения и сжимают данные, это снижает нагрузку на сеть. Агрегаты по многим устройствам и модели считают на платформе.</w:t>
+        <w:t>Spark делит поток на небольшие порции и обрабатывает их одну за другой, поддерживая время события, окна и водяные знаки. От классической пакетной обработки по расписанию это отличается и масштабом порций, и непрерывностью работы.</w:t>
       </w:r>
     </w:p>
     <w:p>
@@ -1332,7 +1322,7 @@
           <w:color w:val="17212B"/>
           <w:sz w:val="24"/>
         </w:rPr>
-        <w:t>Такое разделение уменьшает задержку и стоимость передачи данных.</w:t>
+        <w:t>Граница между подходами определяется моделью обработки, а не только техникой исполнения.</w:t>
       </w:r>
     </w:p>
     <w:p>
@@ -1348,7 +1338,7 @@
           <w:color w:val="0E6680"/>
           <w:sz w:val="22"/>
         </w:rPr>
-        <w:t>7. Приведите пример применения из практики.</w:t>
+        <w:t>7. Если Lambda удваивает логику, зачем её придумали? К какой архитектуре относится пример с насосами?</w:t>
       </w:r>
     </w:p>
     <w:p>
@@ -1374,7 +1364,7 @@
           <w:color w:val="17212B"/>
           <w:sz w:val="24"/>
         </w:rPr>
-        <w:t>Типичный пример: предиктивное обслуживание оборудования.</w:t>
+        <w:t>Lambda появилась, когда потоковые системы ещё не давали точных результатов, и пакетный контур исправлял их.</w:t>
       </w:r>
     </w:p>
     <w:p>
@@ -1400,7 +1390,7 @@
           <w:color w:val="17212B"/>
           <w:sz w:val="24"/>
         </w:rPr>
-        <w:t>Датчики вибрации и температуры на насосах или станках передают данные потоком, а система отслеживает рост показателей в окнах и сообщает о нём до поломки. В докладе этот сценарий показан на условных числах.</w:t>
+        <w:t>Пакетный контур пересчитывает всю историю и устраняет ошибки потокового. Пример с насосами ближе к Kappa: все данные проходят один потоковый контур, а отчёты строятся по сохранённым агрегатам.</w:t>
       </w:r>
     </w:p>
     <w:p>
@@ -1426,7 +1416,7 @@
           <w:color w:val="17212B"/>
           <w:sz w:val="24"/>
         </w:rPr>
-        <w:t>Он показывает, как окна, водяные знаки и брокер сообщений работают вместе.</w:t>
+        <w:t>Развитие потоковых движков позволило во многих задачах отказаться от второго контура.</w:t>
       </w:r>
     </w:p>
     <w:p>
@@ -1442,7 +1432,7 @@
           <w:color w:val="0E6680"/>
           <w:sz w:val="22"/>
         </w:rPr>
-        <w:t>8. Какие гарантии доставки дают потоковые системы?</w:t>
+        <w:t>8. Устройства передают данные по MQTT. Где в схеме брокер MQTT и кто перекладывает данные в Kafka?</w:t>
       </w:r>
     </w:p>
     <w:p>
@@ -1468,7 +1458,7 @@
           <w:color w:val="17212B"/>
           <w:sz w:val="24"/>
         </w:rPr>
-        <w:t>Обычно различают три уровня: не более одного раза, хотя бы один раз и ровно один раз.</w:t>
+        <w:t>Брокер MQTT стоит на стороне сети и платформы и принимает сообщения от устройств; в Kafka их передаёт шлюз или коннектор.</w:t>
       </w:r>
     </w:p>
     <w:p>
@@ -1494,7 +1484,7 @@
           <w:color w:val="17212B"/>
           <w:sz w:val="24"/>
         </w:rPr>
-        <w:t>Брокер и движок обработки вместе обеспечивают нужный уровень за счёт подтверждений, контрольных точек и идемпотентной записи результатов.</w:t>
+        <w:t>Например, коннектор Kafka Connect MQTT Source подписывается на топики брокера MQTT и записывает сообщения в топики Kafka.</w:t>
       </w:r>
     </w:p>
     <w:p>
@@ -1520,7 +1510,195 @@
           <w:color w:val="17212B"/>
           <w:sz w:val="24"/>
         </w:rPr>
-        <w:t>От уровня гарантий зависит, можно ли доверять счётчикам и суммам в отчётах.</w:t>
+        <w:t>MQTT удобен для слабых устройств, а Kafka для надёжного хранения и повторного чтения событий.</w:t>
+      </w:r>
+    </w:p>
+    <w:p>
+      <w:pPr>
+        <w:keepNext/>
+        <w:spacing w:before="200"/>
+      </w:pPr>
+      <w:r>
+        <w:rPr>
+          <w:rFonts w:ascii="Arial" w:hAnsi="Arial" w:eastAsia="Arial" w:cs="Arial"/>
+          <w:b/>
+          <w:i w:val="0"/>
+          <w:color w:val="0E6680"/>
+          <w:sz w:val="22"/>
+        </w:rPr>
+        <w:t>9. Зачем Kafka и Flink для 2 000 событий в секунду?</w:t>
+      </w:r>
+    </w:p>
+    <w:p>
+      <w:pPr>
+        <w:spacing w:after="40"/>
+        <w:ind w:left="340"/>
+      </w:pPr>
+      <w:r>
+        <w:rPr>
+          <w:rFonts w:ascii="Times New Roman" w:hAnsi="Times New Roman" w:eastAsia="Times New Roman" w:cs="Times New Roman"/>
+          <w:b/>
+          <w:i w:val="0"/>
+          <w:color w:val="17212B"/>
+          <w:sz w:val="24"/>
+        </w:rPr>
+        <w:t xml:space="preserve">Ответ: </w:t>
+      </w:r>
+      <w:r>
+        <w:rPr>
+          <w:rFonts w:ascii="Times New Roman" w:hAnsi="Times New Roman" w:eastAsia="Times New Roman" w:cs="Times New Roman"/>
+          <w:b w:val="0"/>
+          <w:i w:val="0"/>
+          <w:color w:val="17212B"/>
+          <w:sz w:val="24"/>
+        </w:rPr>
+        <w:t>Для такого объёма они действительно избыточны; числа в примере условные.</w:t>
+      </w:r>
+    </w:p>
+    <w:p>
+      <w:pPr>
+        <w:spacing w:after="40"/>
+        <w:ind w:left="340"/>
+      </w:pPr>
+      <w:r>
+        <w:rPr>
+          <w:rFonts w:ascii="Times New Roman" w:hAnsi="Times New Roman" w:eastAsia="Times New Roman" w:cs="Times New Roman"/>
+          <w:b/>
+          <w:i w:val="0"/>
+          <w:color w:val="17212B"/>
+          <w:sz w:val="24"/>
+        </w:rPr>
+        <w:t xml:space="preserve">Деталь: </w:t>
+      </w:r>
+      <w:r>
+        <w:rPr>
+          <w:rFonts w:ascii="Times New Roman" w:hAnsi="Times New Roman" w:eastAsia="Times New Roman" w:cs="Times New Roman"/>
+          <w:b w:val="0"/>
+          <w:i w:val="0"/>
+          <w:color w:val="17212B"/>
+          <w:sz w:val="24"/>
+        </w:rPr>
+        <w:t>Пример показывает роли компонентов. При малом объёме хватает брокера MQTT и базы временных рядов с правилами оповещения. Kafka и Flink оправданы, когда устройств и потребителей данных много или нужна повторная обработка истории. Это наша оценка, а не измерение.</w:t>
+      </w:r>
+    </w:p>
+    <w:p>
+      <w:pPr>
+        <w:spacing w:after="40"/>
+        <w:ind w:left="340"/>
+      </w:pPr>
+      <w:r>
+        <w:rPr>
+          <w:rFonts w:ascii="Times New Roman" w:hAnsi="Times New Roman" w:eastAsia="Times New Roman" w:cs="Times New Roman"/>
+          <w:b/>
+          <w:i w:val="0"/>
+          <w:color w:val="17212B"/>
+          <w:sz w:val="24"/>
+        </w:rPr>
+        <w:t xml:space="preserve">Почему важно: </w:t>
+      </w:r>
+      <w:r>
+        <w:rPr>
+          <w:rFonts w:ascii="Times New Roman" w:hAnsi="Times New Roman" w:eastAsia="Times New Roman" w:cs="Times New Roman"/>
+          <w:b w:val="0"/>
+          <w:i w:val="0"/>
+          <w:color w:val="17212B"/>
+          <w:sz w:val="24"/>
+        </w:rPr>
+        <w:t>Архитектуру выбирают по объёму, требованиям к задержке и надёжности.</w:t>
+      </w:r>
+    </w:p>
+    <w:p>
+      <w:pPr>
+        <w:keepNext/>
+        <w:spacing w:before="200"/>
+      </w:pPr>
+      <w:r>
+        <w:rPr>
+          <w:rFonts w:ascii="Arial" w:hAnsi="Arial" w:eastAsia="Arial" w:cs="Arial"/>
+          <w:b/>
+          <w:i w:val="0"/>
+          <w:color w:val="0E6680"/>
+          <w:sz w:val="22"/>
+        </w:rPr>
+        <w:t>10. Какие у потокового подхода ограничения?</w:t>
+      </w:r>
+    </w:p>
+    <w:p>
+      <w:pPr>
+        <w:spacing w:after="40"/>
+        <w:ind w:left="340"/>
+      </w:pPr>
+      <w:r>
+        <w:rPr>
+          <w:rFonts w:ascii="Times New Roman" w:hAnsi="Times New Roman" w:eastAsia="Times New Roman" w:cs="Times New Roman"/>
+          <w:b/>
+          <w:i w:val="0"/>
+          <w:color w:val="17212B"/>
+          <w:sz w:val="24"/>
+        </w:rPr>
+        <w:t xml:space="preserve">Ответ: </w:t>
+      </w:r>
+      <w:r>
+        <w:rPr>
+          <w:rFonts w:ascii="Times New Roman" w:hAnsi="Times New Roman" w:eastAsia="Times New Roman" w:cs="Times New Roman"/>
+          <w:b w:val="0"/>
+          <w:i w:val="0"/>
+          <w:color w:val="17212B"/>
+          <w:sz w:val="24"/>
+        </w:rPr>
+        <w:t>Основные: опоздавшие данные, защита большого числа устройств, стоимость хранения и качество измерений.</w:t>
+      </w:r>
+    </w:p>
+    <w:p>
+      <w:pPr>
+        <w:spacing w:after="40"/>
+        <w:ind w:left="340"/>
+      </w:pPr>
+      <w:r>
+        <w:rPr>
+          <w:rFonts w:ascii="Times New Roman" w:hAnsi="Times New Roman" w:eastAsia="Times New Roman" w:cs="Times New Roman"/>
+          <w:b/>
+          <w:i w:val="0"/>
+          <w:color w:val="17212B"/>
+          <w:sz w:val="24"/>
+        </w:rPr>
+        <w:t xml:space="preserve">Деталь: </w:t>
+      </w:r>
+      <w:r>
+        <w:rPr>
+          <w:rFonts w:ascii="Times New Roman" w:hAnsi="Times New Roman" w:eastAsia="Times New Roman" w:cs="Times New Roman"/>
+          <w:b w:val="0"/>
+          <w:i w:val="0"/>
+          <w:color w:val="17212B"/>
+          <w:sz w:val="24"/>
+        </w:rPr>
+        <w:t>Опоздавшие события требуют пересчёта или отдельного учёта, каждое устройство может стать точкой атаки, длинная история журнала занимает место, а ошибочные замеры датчиков приходится отсеивать на шлюзе или на платформе.</w:t>
+      </w:r>
+    </w:p>
+    <w:p>
+      <w:pPr>
+        <w:spacing w:after="40"/>
+        <w:ind w:left="340"/>
+      </w:pPr>
+      <w:r>
+        <w:rPr>
+          <w:rFonts w:ascii="Times New Roman" w:hAnsi="Times New Roman" w:eastAsia="Times New Roman" w:cs="Times New Roman"/>
+          <w:b/>
+          <w:i w:val="0"/>
+          <w:color w:val="17212B"/>
+          <w:sz w:val="24"/>
+        </w:rPr>
+        <w:t xml:space="preserve">Почему важно: </w:t>
+      </w:r>
+      <w:r>
+        <w:rPr>
+          <w:rFonts w:ascii="Times New Roman" w:hAnsi="Times New Roman" w:eastAsia="Times New Roman" w:cs="Times New Roman"/>
+          <w:b w:val="0"/>
+          <w:i w:val="0"/>
+          <w:color w:val="17212B"/>
+          <w:sz w:val="24"/>
+        </w:rPr>
+        <w:t>Эти ограничения определяют, сколько стоит потоковая система в эксплуатации.</w:t>
       </w:r>
     </w:p>
     <w:p>
@@ -1603,7 +1781,7 @@
           <w:color w:val="17212B"/>
           <w:sz w:val="24"/>
         </w:rPr>
-        <w:t>Генеральный прогон в аудитории или в похожих условиях. Если выступаете вдвоём, отрепетировать передачу слова, например после слайда 6.</w:t>
+        <w:t>Генеральный прогон в аудитории или в похожих условиях. Если выступаете вдвоём, удобно разделить текст так: слайды 1–6 читает один докладчик, слайды 7–12 второй; передача слова после фразы «На практике два подхода дополняют друг друга».</w:t>
       </w:r>
     </w:p>
     <w:p>
@@ -1739,6 +1917,21 @@
           <w:color w:val="17212B"/>
           <w:sz w:val="24"/>
         </w:rPr>
+        <w:t>ITU-T. Recommendation Y.2060: Overview of the Internet of things. 06/2012.</w:t>
+      </w:r>
+    </w:p>
+    <w:p>
+      <w:pPr>
+        <w:pStyle w:val="ListNumber"/>
+      </w:pPr>
+      <w:r>
+        <w:rPr>
+          <w:rFonts w:ascii="Times New Roman" w:hAnsi="Times New Roman" w:eastAsia="Times New Roman" w:cs="Times New Roman"/>
+          <w:b w:val="0"/>
+          <w:i w:val="0"/>
+          <w:color w:val="17212B"/>
+          <w:sz w:val="24"/>
+        </w:rPr>
         <w:t>OASIS. MQTT Version 5.0. OASIS Standard. 7 March 2019.</w:t>
       </w:r>
     </w:p>
@@ -1799,6 +1992,21 @@
           <w:color w:val="17212B"/>
           <w:sz w:val="24"/>
         </w:rPr>
+        <w:t>Confluent. Kafka Connect MQTT Source Connector. Documentation.</w:t>
+      </w:r>
+    </w:p>
+    <w:p>
+      <w:pPr>
+        <w:pStyle w:val="ListNumber"/>
+      </w:pPr>
+      <w:r>
+        <w:rPr>
+          <w:rFonts w:ascii="Times New Roman" w:hAnsi="Times New Roman" w:eastAsia="Times New Roman" w:cs="Times New Roman"/>
+          <w:b w:val="0"/>
+          <w:i w:val="0"/>
+          <w:color w:val="17212B"/>
+          <w:sz w:val="24"/>
+        </w:rPr>
         <w:t>Marz N. How to beat the CAP theorem. 2011.</w:t>
       </w:r>
     </w:p>
@@ -1829,7 +2037,7 @@
           <w:color w:val="17212B"/>
           <w:sz w:val="24"/>
         </w:rPr>
-        <w:t>Apache Flink. Documentation: Windows; Timely Stream Processing.</w:t>
+        <w:t>Apache Flink. Documentation: Windows; Generating Watermarks; Timely Stream Processing.</w:t>
       </w:r>
     </w:p>
     <w:p>

</xml_diff>

<commit_message>
Final polish of IoT presentation and speech after critic review
Co-Authored-By: Claude Opus 5.5 <noreply@anthropic.com>
Claude-Session: https://claude.ai/code/session_01XBBeEGSkQwXXyvWsro7HdT
</commit_message>
<xml_diff>
--- a/presentation-iot-streaming/Интернет вещей и анализ потоковых данных (текст выступления).docx
+++ b/presentation-iot-streaming/Интернет вещей и анализ потоковых данных (текст выступления).docx
@@ -123,7 +123,7 @@
                 <w:color w:val="17212B"/>
                 <w:sz w:val="20"/>
               </w:rPr>
-              <w:t>около 9:56 (1091 слов при темпе 110 слов в минуту)</w:t>
+              <w:t>около 9:56 (около 1090 слов при темпе 110 слов в минуту)</w:t>
             </w:r>
           </w:p>
         </w:tc>
@@ -478,7 +478,7 @@
     </w:p>
     <w:p>
       <w:r>
-        <w:t>Поэтому быстрая реакция, например на аварию, требует потоковой обработки, а отчёты и обучение моделей на истории удобнее строить пакетно. На практике два подхода дополняют друг друга.</w:t>
+        <w:t>Поэтому быстрая реакция, например на аварию, требует потоковой обработки, а отчёты и обучение моделей на истории удобнее выполнять пакетно. На практике два подхода дополняют друг друга.</w:t>
       </w:r>
     </w:p>
     <w:p>
@@ -598,7 +598,7 @@
     </w:p>
     <w:p>
       <w:r>
-        <w:t>Первый компонент: брокер сообщений, например Apache Kafka. Он принимает события от устройств и шлюзов и записывает их в журнал. Журнал хранит события долго, его можно перечитать. Брокер MQTT и Kafka относятся к разным системам, данные между ними передаёт шлюз или коннектор.</w:t>
+        <w:t>Первый компонент: брокер сообщений, например Apache Kafka. Он принимает события от устройств и шлюзов и записывает их в журнал. Журнал хранит события долго, его можно перечитать. Брокер MQTT и Kafka относятся к разным системам: данные между ними передаёт шлюз или коннектор.</w:t>
       </w:r>
     </w:p>
     <w:p>

</xml_diff>